<commit_message>
update the detect all run full report doc
</commit_message>
<xml_diff>
--- a/AVA_BOT_Report.docx
+++ b/AVA_BOT_Report.docx
@@ -358,11 +358,6 @@
         </w:rPr>
         <w:t>Before diving into what's slow, it helps to understand what happens every time someone sends AVA a message. There are more steps than you might expect.</w:t>
       </w:r>
-    </w:p>
-    <w:p>
-      <w:pPr>
-        <w:spacing w:before="80"/>
-      </w:pPr>
     </w:p>
     <w:p>
       <w:pPr>

</xml_diff>